<commit_message>
Guia Pagos ME: corregida para Fundadores sin inventario (pestana Ventas, Comprobar con el banco, verificar antes de imprimir, no bajar guias a mano) + guia interna del duenio para activarlo (PDF)
Co-Authored-By: Claude Opus 5.5 <noreply@anthropic.com>
</commit_message>
<xml_diff>
--- a/tools/vigilante-pagos-me/guia/Guia-Pagos-MercadoEnvios.docx
+++ b/tools/vigilante-pagos-me/guia/Guia-Pagos-MercadoEnvios.docx
@@ -41,7 +41,7 @@
     <w:p>
       <w:pPr>
         <w:pStyle w:val="Heading1"/>
-        <w:spacing w:before="360" w:after="160"/>
+        <w:spacing w:after="160" w:before="360"/>
       </w:pPr>
       <w:r>
         <w:t xml:space="preserve">Qué es y qué ganas</w:t>
@@ -211,7 +211,7 @@
     <w:p>
       <w:pPr>
         <w:pStyle w:val="Heading1"/>
-        <w:spacing w:before="360" w:after="160"/>
+        <w:spacing w:after="160" w:before="360"/>
       </w:pPr>
       <w:r>
         <w:t xml:space="preserve">Antes de empezar</w:t>
@@ -316,7 +316,7 @@
     <w:p>
       <w:pPr>
         <w:pStyle w:val="Heading1"/>
-        <w:spacing w:before="360" w:after="160"/>
+        <w:spacing w:after="160" w:before="360"/>
       </w:pPr>
       <w:r>
         <w:t xml:space="preserve">Conexión paso a paso</w:t>
@@ -325,7 +325,7 @@
     <w:p>
       <w:pPr>
         <w:keepNext/>
-        <w:spacing w:before="300" w:after="100"/>
+        <w:spacing w:after="100" w:before="300"/>
       </w:pPr>
       <w:r>
         <w:rPr>
@@ -377,7 +377,7 @@
     </w:p>
     <w:p>
       <w:pPr>
-        <w:spacing w:before="80" w:after="200"/>
+        <w:spacing w:after="200" w:before="80"/>
         <w:jc w:val="center"/>
       </w:pPr>
       <w:r>
@@ -386,105 +386,6 @@
             <wp:extent cx="5334000" cy="1352550"/>
             <wp:effectExtent t="0" r="0" b="0" l="0"/>
             <wp:docPr id="1" name="01-pantalla-pagos-me.png" descr="01-pantalla-pagos-me.png" title="01-pantalla-pagos-me.png"/>
-            <wp:cNvGraphicFramePr>
-              <a:graphicFrameLocks xmlns:a="http://schemas.openxmlformats.org/drawingml/2006/main" noChangeAspect="1"/>
-            </wp:cNvGraphicFramePr>
-            <a:graphic xmlns:a="http://schemas.openxmlformats.org/drawingml/2006/main">
-              <a:graphicData uri="http://schemas.openxmlformats.org/drawingml/2006/picture">
-                <pic:pic xmlns:pic="http://schemas.openxmlformats.org/drawingml/2006/picture">
-                  <pic:nvPicPr>
-                    <pic:cNvPr id="0" name="" descr=""/>
-                    <pic:cNvPicPr>
-                      <a:picLocks noChangeAspect="1" noChangeArrowheads="1"/>
-                    </pic:cNvPicPr>
-                  </pic:nvPicPr>
-                  <pic:blipFill>
-                    <a:blip r:embed="rId7" cstate="none"/>
-                    <a:srcRect/>
-                    <a:stretch>
-                      <a:fillRect/>
-                    </a:stretch>
-                  </pic:blipFill>
-                  <pic:spPr bwMode="auto">
-                    <a:xfrm>
-                      <a:off x="0" y="0"/>
-                      <a:ext cx="5334000" cy="1352550"/>
-                    </a:xfrm>
-                    <a:prstGeom prst="rect">
-                      <a:avLst/>
-                    </a:prstGeom>
-                  </pic:spPr>
-                </pic:pic>
-              </a:graphicData>
-            </a:graphic>
-          </wp:inline>
-        </w:drawing>
-      </w:r>
-    </w:p>
-    <w:p>
-      <w:pPr>
-        <w:keepNext/>
-        <w:spacing w:before="300" w:after="100"/>
-      </w:pPr>
-      <w:r>
-        <w:rPr>
-          <w:b/>
-          <w:bCs/>
-          <w:color w:val="0E7A4F"/>
-          <w:sz w:val="30"/>
-          <w:szCs w:val="30"/>
-        </w:rPr>
-        <w:t xml:space="preserve">Paso 2  </w:t>
-      </w:r>
-      <w:r>
-        <w:rPr>
-          <w:b/>
-          <w:bCs/>
-          <w:sz w:val="26"/>
-          <w:szCs w:val="26"/>
-        </w:rPr>
-        <w:t xml:space="preserve">Descarga e instala el programa</w:t>
-      </w:r>
-    </w:p>
-    <w:p>
-      <w:pPr>
-        <w:spacing w:after="120"/>
-      </w:pPr>
-      <w:r>
-        <w:t xml:space="preserve">Toca </w:t>
-      </w:r>
-      <w:r>
-        <w:rPr>
-          <w:b/>
-          <w:bCs/>
-        </w:rPr>
-        <w:t xml:space="preserve">Descarga el programa</w:t>
-      </w:r>
-      <w:r>
-        <w:t xml:space="preserve"> y ábrelo. Windows va a mostrar este aviso: toca </w:t>
-      </w:r>
-      <w:r>
-        <w:rPr>
-          <w:b/>
-          <w:bCs/>
-        </w:rPr>
-        <w:t xml:space="preserve">Más información</w:t>
-      </w:r>
-      <w:r>
-        <w:t xml:space="preserve">.</w:t>
-      </w:r>
-    </w:p>
-    <w:p>
-      <w:pPr>
-        <w:spacing w:before="80" w:after="200"/>
-        <w:jc w:val="center"/>
-      </w:pPr>
-      <w:r>
-        <w:drawing>
-          <wp:inline distT="0" distB="0" distL="0" distR="0">
-            <wp:extent cx="2476500" cy="2362200"/>
-            <wp:effectExtent t="0" r="0" b="0" l="0"/>
-            <wp:docPr id="1" name="02a-windows-protegio.png" descr="02a-windows-protegio.png" title="02a-windows-protegio.png"/>
             <wp:cNvGraphicFramePr>
               <a:graphicFrameLocks xmlns:a="http://schemas.openxmlformats.org/drawingml/2006/main" noChangeAspect="1"/>
             </wp:cNvGraphicFramePr>
@@ -507,7 +408,7 @@
                   <pic:spPr bwMode="auto">
                     <a:xfrm>
                       <a:off x="0" y="0"/>
-                      <a:ext cx="2476500" cy="2362200"/>
+                      <a:ext cx="5334000" cy="1352550"/>
                     </a:xfrm>
                     <a:prstGeom prst="rect">
                       <a:avLst/>
@@ -522,6 +423,31 @@
     </w:p>
     <w:p>
       <w:pPr>
+        <w:keepNext/>
+        <w:spacing w:after="100" w:before="300"/>
+      </w:pPr>
+      <w:r>
+        <w:rPr>
+          <w:b/>
+          <w:bCs/>
+          <w:color w:val="0E7A4F"/>
+          <w:sz w:val="30"/>
+          <w:szCs w:val="30"/>
+        </w:rPr>
+        <w:t xml:space="preserve">Paso 2  </w:t>
+      </w:r>
+      <w:r>
+        <w:rPr>
+          <w:b/>
+          <w:bCs/>
+          <w:sz w:val="26"/>
+          <w:szCs w:val="26"/>
+        </w:rPr>
+        <w:t xml:space="preserve">Descarga e instala el programa</w:t>
+      </w:r>
+    </w:p>
+    <w:p>
+      <w:pPr>
         <w:spacing w:after="120"/>
       </w:pPr>
       <w:r>
@@ -532,7 +458,17 @@
           <w:b/>
           <w:bCs/>
         </w:rPr>
-        <w:t xml:space="preserve">Ejecutar de todas formas</w:t>
+        <w:t xml:space="preserve">Descarga el programa</w:t>
+      </w:r>
+      <w:r>
+        <w:t xml:space="preserve"> y ábrelo. Windows va a mostrar este aviso: toca </w:t>
+      </w:r>
+      <w:r>
+        <w:rPr>
+          <w:b/>
+          <w:bCs/>
+        </w:rPr>
+        <w:t xml:space="preserve">Más información</w:t>
       </w:r>
       <w:r>
         <w:t xml:space="preserve">.</w:t>
@@ -540,15 +476,15 @@
     </w:p>
     <w:p>
       <w:pPr>
-        <w:spacing w:before="80" w:after="200"/>
+        <w:spacing w:after="200" w:before="80"/>
         <w:jc w:val="center"/>
       </w:pPr>
       <w:r>
         <w:drawing>
           <wp:inline distT="0" distB="0" distL="0" distR="0">
-            <wp:extent cx="2476500" cy="2305050"/>
+            <wp:extent cx="2476500" cy="2362200"/>
             <wp:effectExtent t="0" r="0" b="0" l="0"/>
-            <wp:docPr id="1" name="02b-ejecutar-de-todas-formas.png" descr="02b-ejecutar-de-todas-formas.png" title="02b-ejecutar-de-todas-formas.png"/>
+            <wp:docPr id="2" name="02a-windows-protegio.png" descr="02a-windows-protegio.png" title="02a-windows-protegio.png"/>
             <wp:cNvGraphicFramePr>
               <a:graphicFrameLocks xmlns:a="http://schemas.openxmlformats.org/drawingml/2006/main" noChangeAspect="1"/>
             </wp:cNvGraphicFramePr>
@@ -571,7 +507,7 @@
                   <pic:spPr bwMode="auto">
                     <a:xfrm>
                       <a:off x="0" y="0"/>
-                      <a:ext cx="2476500" cy="2305050"/>
+                      <a:ext cx="2476500" cy="2362200"/>
                     </a:xfrm>
                     <a:prstGeom prst="rect">
                       <a:avLst/>
@@ -586,57 +522,17 @@
     </w:p>
     <w:p>
       <w:pPr>
-        <w:spacing w:after="160"/>
-      </w:pPr>
-      <w:r>
-        <w:rPr>
-          <w:i/>
-          <w:iCs/>
-          <w:color w:val="555555"/>
-          <w:sz w:val="20"/>
-          <w:szCs w:val="20"/>
-        </w:rPr>
-        <w:t xml:space="preserve">¿Por qué sale? Porque el programa es nuevo y no tiene una firma comprada a Microsoft. Es el de El Comerciante Digital y es seguro; el aviso sale una sola vez.</w:t>
-      </w:r>
-    </w:p>
-    <w:p>
-      <w:pPr>
-        <w:keepNext/>
-        <w:spacing w:before="300" w:after="100"/>
-      </w:pPr>
-      <w:r>
-        <w:rPr>
-          <w:b/>
-          <w:bCs/>
-          <w:color w:val="0E7A4F"/>
-          <w:sz w:val="30"/>
-          <w:szCs w:val="30"/>
-        </w:rPr>
-        <w:t xml:space="preserve">Paso 3  </w:t>
-      </w:r>
-      <w:r>
-        <w:rPr>
-          <w:b/>
-          <w:bCs/>
-          <w:sz w:val="26"/>
-          <w:szCs w:val="26"/>
-        </w:rPr>
-        <w:t xml:space="preserve">Genera tu código y escríbelo en el programa</w:t>
-      </w:r>
-    </w:p>
-    <w:p>
-      <w:pPr>
-        <w:spacing w:after="120"/>
-      </w:pPr>
-      <w:r>
-        <w:t xml:space="preserve">El programa pide un </w:t>
-      </w:r>
-      <w:r>
-        <w:rPr>
-          <w:b/>
-          <w:bCs/>
-        </w:rPr>
-        <w:t xml:space="preserve">código de conexión</w:t>
+        <w:spacing w:after="120"/>
+      </w:pPr>
+      <w:r>
+        <w:t xml:space="preserve">Toca </w:t>
+      </w:r>
+      <w:r>
+        <w:rPr>
+          <w:b/>
+          <w:bCs/>
+        </w:rPr>
+        <w:t xml:space="preserve">Ejecutar de todas formas</w:t>
       </w:r>
       <w:r>
         <w:t xml:space="preserve">.</w:t>
@@ -644,15 +540,15 @@
     </w:p>
     <w:p>
       <w:pPr>
-        <w:spacing w:before="80" w:after="200"/>
+        <w:spacing w:after="200" w:before="80"/>
         <w:jc w:val="center"/>
       </w:pPr>
       <w:r>
         <w:drawing>
           <wp:inline distT="0" distB="0" distL="0" distR="0">
-            <wp:extent cx="3429000" cy="2628900"/>
+            <wp:extent cx="2476500" cy="2305050"/>
             <wp:effectExtent t="0" r="0" b="0" l="0"/>
-            <wp:docPr id="1" name="03-programa-pide-codigo.png" descr="03-programa-pide-codigo.png" title="03-programa-pide-codigo.png"/>
+            <wp:docPr id="3" name="02b-ejecutar-de-todas-formas.png" descr="02b-ejecutar-de-todas-formas.png" title="02b-ejecutar-de-todas-formas.png"/>
             <wp:cNvGraphicFramePr>
               <a:graphicFrameLocks xmlns:a="http://schemas.openxmlformats.org/drawingml/2006/main" noChangeAspect="1"/>
             </wp:cNvGraphicFramePr>
@@ -675,7 +571,7 @@
                   <pic:spPr bwMode="auto">
                     <a:xfrm>
                       <a:off x="0" y="0"/>
-                      <a:ext cx="3429000" cy="2628900"/>
+                      <a:ext cx="2476500" cy="2305050"/>
                     </a:xfrm>
                     <a:prstGeom prst="rect">
                       <a:avLst/>
@@ -690,53 +586,73 @@
     </w:p>
     <w:p>
       <w:pPr>
-        <w:spacing w:after="120"/>
-      </w:pPr>
-      <w:r>
-        <w:t xml:space="preserve">En Pagos ME toca </w:t>
-      </w:r>
-      <w:r>
-        <w:rPr>
-          <w:b/>
-          <w:bCs/>
-        </w:rPr>
-        <w:t xml:space="preserve">Genera tu código</w:t>
-      </w:r>
-      <w:r>
-        <w:t xml:space="preserve"> (o </w:t>
-      </w:r>
-      <w:r>
-        <w:rPr>
-          <w:b/>
-          <w:bCs/>
-        </w:rPr>
-        <w:t xml:space="preserve">Conectar una PC</w:t>
-      </w:r>
-      <w:r>
-        <w:t xml:space="preserve">). Aparece un código como este: tócalo en </w:t>
-      </w:r>
-      <w:r>
-        <w:rPr>
-          <w:b/>
-          <w:bCs/>
-        </w:rPr>
-        <w:t xml:space="preserve">Copiar</w:t>
-      </w:r>
-      <w:r>
-        <w:t xml:space="preserve"> y pégalo en el programa.</w:t>
-      </w:r>
-    </w:p>
-    <w:p>
-      <w:pPr>
-        <w:spacing w:before="80" w:after="200"/>
+        <w:spacing w:after="160"/>
+      </w:pPr>
+      <w:r>
+        <w:rPr>
+          <w:i/>
+          <w:iCs/>
+          <w:color w:val="555555"/>
+          <w:sz w:val="20"/>
+          <w:szCs w:val="20"/>
+        </w:rPr>
+        <w:t xml:space="preserve">¿Por qué sale? Porque el programa es nuevo y no tiene una firma comprada a Microsoft. Es el de El Comerciante Digital y es seguro; el aviso sale una sola vez.</w:t>
+      </w:r>
+    </w:p>
+    <w:p>
+      <w:pPr>
+        <w:keepNext/>
+        <w:spacing w:after="100" w:before="300"/>
+      </w:pPr>
+      <w:r>
+        <w:rPr>
+          <w:b/>
+          <w:bCs/>
+          <w:color w:val="0E7A4F"/>
+          <w:sz w:val="30"/>
+          <w:szCs w:val="30"/>
+        </w:rPr>
+        <w:t xml:space="preserve">Paso 3  </w:t>
+      </w:r>
+      <w:r>
+        <w:rPr>
+          <w:b/>
+          <w:bCs/>
+          <w:sz w:val="26"/>
+          <w:szCs w:val="26"/>
+        </w:rPr>
+        <w:t xml:space="preserve">Genera tu código y escríbelo en el programa</w:t>
+      </w:r>
+    </w:p>
+    <w:p>
+      <w:pPr>
+        <w:spacing w:after="120"/>
+      </w:pPr>
+      <w:r>
+        <w:t xml:space="preserve">El programa pide un </w:t>
+      </w:r>
+      <w:r>
+        <w:rPr>
+          <w:b/>
+          <w:bCs/>
+        </w:rPr>
+        <w:t xml:space="preserve">código de conexión</w:t>
+      </w:r>
+      <w:r>
+        <w:t xml:space="preserve">.</w:t>
+      </w:r>
+    </w:p>
+    <w:p>
+      <w:pPr>
+        <w:spacing w:after="200" w:before="80"/>
         <w:jc w:val="center"/>
       </w:pPr>
       <w:r>
         <w:drawing>
           <wp:inline distT="0" distB="0" distL="0" distR="0">
-            <wp:extent cx="5334000" cy="495300"/>
+            <wp:extent cx="3429000" cy="2628900"/>
             <wp:effectExtent t="0" r="0" b="0" l="0"/>
-            <wp:docPr id="1" name="03b-codigo-en-pagos-me.png" descr="03b-codigo-en-pagos-me.png" title="03b-codigo-en-pagos-me.png"/>
+            <wp:docPr id="4" name="03-programa-pide-codigo.png" descr="03-programa-pide-codigo.png" title="03-programa-pide-codigo.png"/>
             <wp:cNvGraphicFramePr>
               <a:graphicFrameLocks xmlns:a="http://schemas.openxmlformats.org/drawingml/2006/main" noChangeAspect="1"/>
             </wp:cNvGraphicFramePr>
@@ -759,7 +675,7 @@
                   <pic:spPr bwMode="auto">
                     <a:xfrm>
                       <a:off x="0" y="0"/>
-                      <a:ext cx="5334000" cy="495300"/>
+                      <a:ext cx="3429000" cy="2628900"/>
                     </a:xfrm>
                     <a:prstGeom prst="rect">
                       <a:avLst/>
@@ -774,73 +690,53 @@
     </w:p>
     <w:p>
       <w:pPr>
-        <w:spacing w:after="160"/>
-      </w:pPr>
-      <w:r>
-        <w:rPr>
-          <w:i/>
-          <w:iCs/>
-          <w:color w:val="555555"/>
-          <w:sz w:val="20"/>
-          <w:szCs w:val="20"/>
-        </w:rPr>
-        <w:t xml:space="preserve">El código vale 60 minutos y sirve para todo: el programa y la extensión de cada cuenta. Si se te vence, genera otro; lo ya conectado sigue funcionando.</w:t>
-      </w:r>
-    </w:p>
-    <w:p>
-      <w:pPr>
-        <w:keepNext/>
-        <w:spacing w:before="300" w:after="100"/>
-      </w:pPr>
-      <w:r>
-        <w:rPr>
-          <w:b/>
-          <w:bCs/>
-          <w:color w:val="0E7A4F"/>
-          <w:sz w:val="30"/>
-          <w:szCs w:val="30"/>
-        </w:rPr>
-        <w:t xml:space="preserve">Paso 4  </w:t>
-      </w:r>
-      <w:r>
-        <w:rPr>
-          <w:b/>
-          <w:bCs/>
-          <w:sz w:val="26"/>
-          <w:szCs w:val="26"/>
-        </w:rPr>
-        <w:t xml:space="preserve">Termina la instalación</w:t>
-      </w:r>
-    </w:p>
-    <w:p>
-      <w:pPr>
-        <w:spacing w:after="120"/>
-      </w:pPr>
-      <w:r>
-        <w:t xml:space="preserve">Toca </w:t>
-      </w:r>
-      <w:r>
-        <w:rPr>
-          <w:b/>
-          <w:bCs/>
-        </w:rPr>
-        <w:t xml:space="preserve">Siguiente</w:t>
-      </w:r>
-      <w:r>
-        <w:t xml:space="preserve">.</w:t>
-      </w:r>
-    </w:p>
-    <w:p>
-      <w:pPr>
-        <w:spacing w:before="80" w:after="200"/>
+        <w:spacing w:after="120"/>
+      </w:pPr>
+      <w:r>
+        <w:t xml:space="preserve">En Pagos ME toca </w:t>
+      </w:r>
+      <w:r>
+        <w:rPr>
+          <w:b/>
+          <w:bCs/>
+        </w:rPr>
+        <w:t xml:space="preserve">Genera tu código</w:t>
+      </w:r>
+      <w:r>
+        <w:t xml:space="preserve"> (o </w:t>
+      </w:r>
+      <w:r>
+        <w:rPr>
+          <w:b/>
+          <w:bCs/>
+        </w:rPr>
+        <w:t xml:space="preserve">Conectar una PC</w:t>
+      </w:r>
+      <w:r>
+        <w:t xml:space="preserve">). Aparece un código como este: tócalo en </w:t>
+      </w:r>
+      <w:r>
+        <w:rPr>
+          <w:b/>
+          <w:bCs/>
+        </w:rPr>
+        <w:t xml:space="preserve">Copiar</w:t>
+      </w:r>
+      <w:r>
+        <w:t xml:space="preserve"> y pégalo en el programa.</w:t>
+      </w:r>
+    </w:p>
+    <w:p>
+      <w:pPr>
+        <w:spacing w:after="200" w:before="80"/>
         <w:jc w:val="center"/>
       </w:pPr>
       <w:r>
         <w:drawing>
           <wp:inline distT="0" distB="0" distL="0" distR="0">
-            <wp:extent cx="3429000" cy="2638425"/>
+            <wp:extent cx="5334000" cy="495300"/>
             <wp:effectExtent t="0" r="0" b="0" l="0"/>
-            <wp:docPr id="1" name="04-programa-instalado.png" descr="04-programa-instalado.png" title="04-programa-instalado.png"/>
+            <wp:docPr id="5" name="03b-codigo-en-pagos-me.png" descr="03b-codigo-en-pagos-me.png" title="03b-codigo-en-pagos-me.png"/>
             <wp:cNvGraphicFramePr>
               <a:graphicFrameLocks xmlns:a="http://schemas.openxmlformats.org/drawingml/2006/main" noChangeAspect="1"/>
             </wp:cNvGraphicFramePr>
@@ -863,7 +759,7 @@
                   <pic:spPr bwMode="auto">
                     <a:xfrm>
                       <a:off x="0" y="0"/>
-                      <a:ext cx="3429000" cy="2638425"/>
+                      <a:ext cx="5334000" cy="495300"/>
                     </a:xfrm>
                     <a:prstGeom prst="rect">
                       <a:avLst/>
@@ -878,37 +774,57 @@
     </w:p>
     <w:p>
       <w:pPr>
-        <w:spacing w:after="120"/>
-      </w:pPr>
-      <w:r>
-        <w:t xml:space="preserve">Deja marcadas </w:t>
-      </w:r>
-      <w:r>
-        <w:rPr>
-          <w:b/>
-          <w:bCs/>
-        </w:rPr>
-        <w:t xml:space="preserve">Arrancar el programa ahora</w:t>
-      </w:r>
-      <w:r>
-        <w:t xml:space="preserve"> y </w:t>
-      </w:r>
-      <w:r>
-        <w:rPr>
-          <w:b/>
-          <w:bCs/>
-        </w:rPr>
-        <w:t xml:space="preserve">Ver cómo agregar el Asistente de envíos a Chrome</w:t>
-      </w:r>
-      <w:r>
-        <w:t xml:space="preserve">, y toca </w:t>
-      </w:r>
-      <w:r>
-        <w:rPr>
-          <w:b/>
-          <w:bCs/>
-        </w:rPr>
-        <w:t xml:space="preserve">Finalizar</w:t>
+        <w:spacing w:after="160"/>
+      </w:pPr>
+      <w:r>
+        <w:rPr>
+          <w:i/>
+          <w:iCs/>
+          <w:color w:val="555555"/>
+          <w:sz w:val="20"/>
+          <w:szCs w:val="20"/>
+        </w:rPr>
+        <w:t xml:space="preserve">El código vale 60 minutos y sirve para todo: el programa y la extensión de cada cuenta. Si se te vence, genera otro; lo ya conectado sigue funcionando.</w:t>
+      </w:r>
+    </w:p>
+    <w:p>
+      <w:pPr>
+        <w:keepNext/>
+        <w:spacing w:after="100" w:before="300"/>
+      </w:pPr>
+      <w:r>
+        <w:rPr>
+          <w:b/>
+          <w:bCs/>
+          <w:color w:val="0E7A4F"/>
+          <w:sz w:val="30"/>
+          <w:szCs w:val="30"/>
+        </w:rPr>
+        <w:t xml:space="preserve">Paso 4  </w:t>
+      </w:r>
+      <w:r>
+        <w:rPr>
+          <w:b/>
+          <w:bCs/>
+          <w:sz w:val="26"/>
+          <w:szCs w:val="26"/>
+        </w:rPr>
+        <w:t xml:space="preserve">Termina la instalación</w:t>
+      </w:r>
+    </w:p>
+    <w:p>
+      <w:pPr>
+        <w:spacing w:after="120"/>
+      </w:pPr>
+      <w:r>
+        <w:t xml:space="preserve">Toca </w:t>
+      </w:r>
+      <w:r>
+        <w:rPr>
+          <w:b/>
+          <w:bCs/>
+        </w:rPr>
+        <w:t xml:space="preserve">Siguiente</w:t>
       </w:r>
       <w:r>
         <w:t xml:space="preserve">.</w:t>
@@ -916,15 +832,15 @@
     </w:p>
     <w:p>
       <w:pPr>
-        <w:spacing w:before="80" w:after="200"/>
+        <w:spacing w:after="200" w:before="80"/>
         <w:jc w:val="center"/>
       </w:pPr>
       <w:r>
         <w:drawing>
           <wp:inline distT="0" distB="0" distL="0" distR="0">
-            <wp:extent cx="3429000" cy="2619375"/>
+            <wp:extent cx="3429000" cy="2638425"/>
             <wp:effectExtent t="0" r="0" b="0" l="0"/>
-            <wp:docPr id="1" name="05-finalizar-instalacion.png" descr="05-finalizar-instalacion.png" title="05-finalizar-instalacion.png"/>
+            <wp:docPr id="6" name="04-programa-instalado.png" descr="04-programa-instalado.png" title="04-programa-instalado.png"/>
             <wp:cNvGraphicFramePr>
               <a:graphicFrameLocks xmlns:a="http://schemas.openxmlformats.org/drawingml/2006/main" noChangeAspect="1"/>
             </wp:cNvGraphicFramePr>
@@ -947,7 +863,7 @@
                   <pic:spPr bwMode="auto">
                     <a:xfrm>
                       <a:off x="0" y="0"/>
-                      <a:ext cx="3429000" cy="2619375"/>
+                      <a:ext cx="3429000" cy="2638425"/>
                     </a:xfrm>
                     <a:prstGeom prst="rect">
                       <a:avLst/>
@@ -962,42 +878,37 @@
     </w:p>
     <w:p>
       <w:pPr>
-        <w:keepNext/>
-        <w:spacing w:before="300" w:after="100"/>
-      </w:pPr>
-      <w:r>
-        <w:rPr>
-          <w:b/>
-          <w:bCs/>
-          <w:color w:val="0E7A4F"/>
-          <w:sz w:val="30"/>
-          <w:szCs w:val="30"/>
-        </w:rPr>
-        <w:t xml:space="preserve">Paso 5  </w:t>
-      </w:r>
-      <w:r>
-        <w:rPr>
-          <w:b/>
-          <w:bCs/>
-          <w:sz w:val="26"/>
-          <w:szCs w:val="26"/>
-        </w:rPr>
-        <w:t xml:space="preserve">Agrega el Asistente de envíos a Chrome</w:t>
-      </w:r>
-    </w:p>
-    <w:p>
-      <w:pPr>
-        <w:spacing w:after="120"/>
-      </w:pPr>
-      <w:r>
-        <w:t xml:space="preserve">Se abre la tienda de Chrome. Toca </w:t>
-      </w:r>
-      <w:r>
-        <w:rPr>
-          <w:b/>
-          <w:bCs/>
-        </w:rPr>
-        <w:t xml:space="preserve">Añadir a Chrome</w:t>
+        <w:spacing w:after="120"/>
+      </w:pPr>
+      <w:r>
+        <w:t xml:space="preserve">Deja marcadas </w:t>
+      </w:r>
+      <w:r>
+        <w:rPr>
+          <w:b/>
+          <w:bCs/>
+        </w:rPr>
+        <w:t xml:space="preserve">Arrancar el programa ahora</w:t>
+      </w:r>
+      <w:r>
+        <w:t xml:space="preserve"> y </w:t>
+      </w:r>
+      <w:r>
+        <w:rPr>
+          <w:b/>
+          <w:bCs/>
+        </w:rPr>
+        <w:t xml:space="preserve">Ver cómo agregar el Asistente de envíos a Chrome</w:t>
+      </w:r>
+      <w:r>
+        <w:t xml:space="preserve">, y toca </w:t>
+      </w:r>
+      <w:r>
+        <w:rPr>
+          <w:b/>
+          <w:bCs/>
+        </w:rPr>
+        <w:t xml:space="preserve">Finalizar</w:t>
       </w:r>
       <w:r>
         <w:t xml:space="preserve">.</w:t>
@@ -1005,15 +916,15 @@
     </w:p>
     <w:p>
       <w:pPr>
-        <w:spacing w:before="80" w:after="200"/>
+        <w:spacing w:after="200" w:before="80"/>
         <w:jc w:val="center"/>
       </w:pPr>
       <w:r>
         <w:drawing>
           <wp:inline distT="0" distB="0" distL="0" distR="0">
-            <wp:extent cx="5334000" cy="2657475"/>
+            <wp:extent cx="3429000" cy="2619375"/>
             <wp:effectExtent t="0" r="0" b="0" l="0"/>
-            <wp:docPr id="1" name="06-tienda-chrome.png" descr="06-tienda-chrome.png" title="06-tienda-chrome.png"/>
+            <wp:docPr id="7" name="05-finalizar-instalacion.png" descr="05-finalizar-instalacion.png" title="05-finalizar-instalacion.png"/>
             <wp:cNvGraphicFramePr>
               <a:graphicFrameLocks xmlns:a="http://schemas.openxmlformats.org/drawingml/2006/main" noChangeAspect="1"/>
             </wp:cNvGraphicFramePr>
@@ -1036,7 +947,7 @@
                   <pic:spPr bwMode="auto">
                     <a:xfrm>
                       <a:off x="0" y="0"/>
-                      <a:ext cx="5334000" cy="2657475"/>
+                      <a:ext cx="3429000" cy="2619375"/>
                     </a:xfrm>
                     <a:prstGeom prst="rect">
                       <a:avLst/>
@@ -1051,17 +962,42 @@
     </w:p>
     <w:p>
       <w:pPr>
-        <w:spacing w:after="120"/>
-      </w:pPr>
-      <w:r>
-        <w:t xml:space="preserve">Confirma con </w:t>
-      </w:r>
-      <w:r>
-        <w:rPr>
-          <w:b/>
-          <w:bCs/>
-        </w:rPr>
-        <w:t xml:space="preserve">Añadir extensión</w:t>
+        <w:keepNext/>
+        <w:spacing w:after="100" w:before="300"/>
+      </w:pPr>
+      <w:r>
+        <w:rPr>
+          <w:b/>
+          <w:bCs/>
+          <w:color w:val="0E7A4F"/>
+          <w:sz w:val="30"/>
+          <w:szCs w:val="30"/>
+        </w:rPr>
+        <w:t xml:space="preserve">Paso 5  </w:t>
+      </w:r>
+      <w:r>
+        <w:rPr>
+          <w:b/>
+          <w:bCs/>
+          <w:sz w:val="26"/>
+          <w:szCs w:val="26"/>
+        </w:rPr>
+        <w:t xml:space="preserve">Agrega el Asistente de envíos a Chrome</w:t>
+      </w:r>
+    </w:p>
+    <w:p>
+      <w:pPr>
+        <w:spacing w:after="120"/>
+      </w:pPr>
+      <w:r>
+        <w:t xml:space="preserve">Se abre la tienda de Chrome. Toca </w:t>
+      </w:r>
+      <w:r>
+        <w:rPr>
+          <w:b/>
+          <w:bCs/>
+        </w:rPr>
+        <w:t xml:space="preserve">Añadir a Chrome</w:t>
       </w:r>
       <w:r>
         <w:t xml:space="preserve">.</w:t>
@@ -1069,15 +1005,15 @@
     </w:p>
     <w:p>
       <w:pPr>
-        <w:spacing w:before="80" w:after="200"/>
+        <w:spacing w:after="200" w:before="80"/>
         <w:jc w:val="center"/>
       </w:pPr>
       <w:r>
         <w:drawing>
           <wp:inline distT="0" distB="0" distL="0" distR="0">
-            <wp:extent cx="3238500" cy="1838325"/>
+            <wp:extent cx="5334000" cy="2657475"/>
             <wp:effectExtent t="0" r="0" b="0" l="0"/>
-            <wp:docPr id="1" name="07-anadir-extension.png" descr="07-anadir-extension.png" title="07-anadir-extension.png"/>
+            <wp:docPr id="8" name="06-tienda-chrome.png" descr="06-tienda-chrome.png" title="06-tienda-chrome.png"/>
             <wp:cNvGraphicFramePr>
               <a:graphicFrameLocks xmlns:a="http://schemas.openxmlformats.org/drawingml/2006/main" noChangeAspect="1"/>
             </wp:cNvGraphicFramePr>
@@ -1100,7 +1036,7 @@
                   <pic:spPr bwMode="auto">
                     <a:xfrm>
                       <a:off x="0" y="0"/>
-                      <a:ext cx="3238500" cy="1838325"/>
+                      <a:ext cx="5334000" cy="2657475"/>
                     </a:xfrm>
                     <a:prstGeom prst="rect">
                       <a:avLst/>
@@ -1115,38 +1051,33 @@
     </w:p>
     <w:p>
       <w:pPr>
-        <w:spacing w:after="160"/>
-      </w:pPr>
-      <w:r>
-        <w:rPr>
-          <w:i/>
-          <w:iCs/>
-          <w:color w:val="555555"/>
-          <w:sz w:val="20"/>
-          <w:szCs w:val="20"/>
-        </w:rPr>
-        <w:t xml:space="preserve">Chrome dice «Leer tu historial de navegación» por un permiso técnico (la extensión necesita encontrar y cerrar la pestaña del portal que abre). No lee tu historial.</w:t>
-      </w:r>
-    </w:p>
-    <w:p>
-      <w:pPr>
-        <w:spacing w:after="120"/>
-      </w:pPr>
-      <w:r>
-        <w:t xml:space="preserve">Listo. No hace falta «Iniciar sesión en Chrome»: cierra este aviso con la ✕.</w:t>
-      </w:r>
-    </w:p>
-    <w:p>
-      <w:pPr>
-        <w:spacing w:before="80" w:after="200"/>
+        <w:spacing w:after="120"/>
+      </w:pPr>
+      <w:r>
+        <w:t xml:space="preserve">Confirma con </w:t>
+      </w:r>
+      <w:r>
+        <w:rPr>
+          <w:b/>
+          <w:bCs/>
+        </w:rPr>
+        <w:t xml:space="preserve">Añadir extensión</w:t>
+      </w:r>
+      <w:r>
+        <w:t xml:space="preserve">.</w:t>
+      </w:r>
+    </w:p>
+    <w:p>
+      <w:pPr>
+        <w:spacing w:after="200" w:before="80"/>
         <w:jc w:val="center"/>
       </w:pPr>
       <w:r>
         <w:drawing>
           <wp:inline distT="0" distB="0" distL="0" distR="0">
-            <wp:extent cx="2476500" cy="2190750"/>
+            <wp:extent cx="3238500" cy="1838325"/>
             <wp:effectExtent t="0" r="0" b="0" l="0"/>
-            <wp:docPr id="1" name="08-extension-anadida.png" descr="08-extension-anadida.png" title="08-extension-anadida.png"/>
+            <wp:docPr id="9" name="07-anadir-extension.png" descr="07-anadir-extension.png" title="07-anadir-extension.png"/>
             <wp:cNvGraphicFramePr>
               <a:graphicFrameLocks xmlns:a="http://schemas.openxmlformats.org/drawingml/2006/main" noChangeAspect="1"/>
             </wp:cNvGraphicFramePr>
@@ -1169,7 +1100,7 @@
                   <pic:spPr bwMode="auto">
                     <a:xfrm>
                       <a:off x="0" y="0"/>
-                      <a:ext cx="2476500" cy="2190750"/>
+                      <a:ext cx="3238500" cy="1838325"/>
                     </a:xfrm>
                     <a:prstGeom prst="rect">
                       <a:avLst/>
@@ -1184,88 +1115,38 @@
     </w:p>
     <w:p>
       <w:pPr>
-        <w:keepNext/>
-        <w:spacing w:before="300" w:after="100"/>
-      </w:pPr>
-      <w:r>
-        <w:rPr>
-          <w:b/>
-          <w:bCs/>
-          <w:color w:val="0E7A4F"/>
-          <w:sz w:val="30"/>
-          <w:szCs w:val="30"/>
-        </w:rPr>
-        <w:t xml:space="preserve">Paso 6  </w:t>
-      </w:r>
-      <w:r>
-        <w:rPr>
-          <w:b/>
-          <w:bCs/>
-          <w:sz w:val="26"/>
-          <w:szCs w:val="26"/>
-        </w:rPr>
-        <w:t xml:space="preserve">Conecta la extensión con el mismo código</w:t>
-      </w:r>
-    </w:p>
-    <w:p>
-      <w:pPr>
-        <w:spacing w:after="120"/>
-      </w:pPr>
-      <w:r>
-        <w:t xml:space="preserve">Toca la </w:t>
-      </w:r>
-      <w:r>
-        <w:rPr>
-          <w:b/>
-          <w:bCs/>
-        </w:rPr>
-        <w:t xml:space="preserve">pieza de rompecabezas</w:t>
-      </w:r>
-      <w:r>
-        <w:t xml:space="preserve"> (arriba a la derecha de Chrome) → el </w:t>
-      </w:r>
-      <w:r>
-        <w:rPr>
-          <w:b/>
-          <w:bCs/>
-        </w:rPr>
-        <w:t xml:space="preserve">pin</w:t>
-      </w:r>
-      <w:r>
-        <w:t xml:space="preserve"> junto a «Asistente de envíos» para dejarlo a la vista → ábrelo. Escribe el </w:t>
-      </w:r>
-      <w:r>
-        <w:rPr>
-          <w:b/>
-          <w:bCs/>
-        </w:rPr>
-        <w:t xml:space="preserve">mismo código</w:t>
-      </w:r>
-      <w:r>
-        <w:t xml:space="preserve"> y toca </w:t>
-      </w:r>
-      <w:r>
-        <w:rPr>
-          <w:b/>
-          <w:bCs/>
-        </w:rPr>
-        <w:t xml:space="preserve">Conectar</w:t>
-      </w:r>
-      <w:r>
-        <w:t xml:space="preserve">.</w:t>
-      </w:r>
-    </w:p>
-    <w:p>
-      <w:pPr>
-        <w:spacing w:before="80" w:after="200"/>
+        <w:spacing w:after="160"/>
+      </w:pPr>
+      <w:r>
+        <w:rPr>
+          <w:i/>
+          <w:iCs/>
+          <w:color w:val="555555"/>
+          <w:sz w:val="20"/>
+          <w:szCs w:val="20"/>
+        </w:rPr>
+        <w:t xml:space="preserve">Chrome dice «Leer tu historial de navegación» por un permiso técnico (la extensión necesita encontrar y cerrar la pestaña del portal que abre). No lee tu historial.</w:t>
+      </w:r>
+    </w:p>
+    <w:p>
+      <w:pPr>
+        <w:spacing w:after="120"/>
+      </w:pPr>
+      <w:r>
+        <w:t xml:space="preserve">Listo. No hace falta «Iniciar sesión en Chrome»: cierra este aviso con la ✕.</w:t>
+      </w:r>
+    </w:p>
+    <w:p>
+      <w:pPr>
+        <w:spacing w:after="200" w:before="80"/>
         <w:jc w:val="center"/>
       </w:pPr>
       <w:r>
         <w:drawing>
           <wp:inline distT="0" distB="0" distL="0" distR="0">
-            <wp:extent cx="3048000" cy="2219325"/>
+            <wp:extent cx="2476500" cy="2190750"/>
             <wp:effectExtent t="0" r="0" b="0" l="0"/>
-            <wp:docPr id="1" name="09-extension-pide-codigo.png" descr="09-extension-pide-codigo.png" title="09-extension-pide-codigo.png"/>
+            <wp:docPr id="10" name="08-extension-anadida.png" descr="08-extension-anadida.png" title="08-extension-anadida.png"/>
             <wp:cNvGraphicFramePr>
               <a:graphicFrameLocks xmlns:a="http://schemas.openxmlformats.org/drawingml/2006/main" noChangeAspect="1"/>
             </wp:cNvGraphicFramePr>
@@ -1288,7 +1169,7 @@
                   <pic:spPr bwMode="auto">
                     <a:xfrm>
                       <a:off x="0" y="0"/>
-                      <a:ext cx="3048000" cy="2219325"/>
+                      <a:ext cx="2476500" cy="2190750"/>
                     </a:xfrm>
                     <a:prstGeom prst="rect">
                       <a:avLst/>
@@ -1303,33 +1184,88 @@
     </w:p>
     <w:p>
       <w:pPr>
-        <w:spacing w:after="120"/>
-      </w:pPr>
-      <w:r>
-        <w:t xml:space="preserve">Debe decir </w:t>
-      </w:r>
-      <w:r>
-        <w:rPr>
-          <w:b/>
-          <w:bCs/>
-        </w:rPr>
-        <w:t xml:space="preserve">Conectado al sistema</w:t>
-      </w:r>
-      <w:r>
-        <w:t xml:space="preserve"> y mostrar tu cuenta de MercadoEnvíos.</w:t>
-      </w:r>
-    </w:p>
-    <w:p>
-      <w:pPr>
-        <w:spacing w:before="80" w:after="200"/>
+        <w:keepNext/>
+        <w:spacing w:after="100" w:before="300"/>
+      </w:pPr>
+      <w:r>
+        <w:rPr>
+          <w:b/>
+          <w:bCs/>
+          <w:color w:val="0E7A4F"/>
+          <w:sz w:val="30"/>
+          <w:szCs w:val="30"/>
+        </w:rPr>
+        <w:t xml:space="preserve">Paso 6  </w:t>
+      </w:r>
+      <w:r>
+        <w:rPr>
+          <w:b/>
+          <w:bCs/>
+          <w:sz w:val="26"/>
+          <w:szCs w:val="26"/>
+        </w:rPr>
+        <w:t xml:space="preserve">Conecta la extensión con el mismo código</w:t>
+      </w:r>
+    </w:p>
+    <w:p>
+      <w:pPr>
+        <w:spacing w:after="120"/>
+      </w:pPr>
+      <w:r>
+        <w:t xml:space="preserve">Toca la </w:t>
+      </w:r>
+      <w:r>
+        <w:rPr>
+          <w:b/>
+          <w:bCs/>
+        </w:rPr>
+        <w:t xml:space="preserve">pieza de rompecabezas</w:t>
+      </w:r>
+      <w:r>
+        <w:t xml:space="preserve"> (arriba a la derecha de Chrome) → el </w:t>
+      </w:r>
+      <w:r>
+        <w:rPr>
+          <w:b/>
+          <w:bCs/>
+        </w:rPr>
+        <w:t xml:space="preserve">pin</w:t>
+      </w:r>
+      <w:r>
+        <w:t xml:space="preserve"> junto a «Asistente de envíos» para dejarlo a la vista → ábrelo. Escribe el </w:t>
+      </w:r>
+      <w:r>
+        <w:rPr>
+          <w:b/>
+          <w:bCs/>
+        </w:rPr>
+        <w:t xml:space="preserve">mismo código</w:t>
+      </w:r>
+      <w:r>
+        <w:t xml:space="preserve"> y toca </w:t>
+      </w:r>
+      <w:r>
+        <w:rPr>
+          <w:b/>
+          <w:bCs/>
+        </w:rPr>
+        <w:t xml:space="preserve">Conectar</w:t>
+      </w:r>
+      <w:r>
+        <w:t xml:space="preserve">.</w:t>
+      </w:r>
+    </w:p>
+    <w:p>
+      <w:pPr>
+        <w:spacing w:after="200" w:before="80"/>
         <w:jc w:val="center"/>
       </w:pPr>
       <w:r>
         <w:drawing>
           <wp:inline distT="0" distB="0" distL="0" distR="0">
-            <wp:extent cx="3048000" cy="2324100"/>
+            <wp:extent cx="3048000" cy="2219325"/>
             <wp:effectExtent t="0" r="0" b="0" l="0"/>
-            <wp:docPr id="1" name="10-extension-conectada.png" descr="10-extension-conectada.png" title="10-extension-conectada.png"/>
+            <wp:docPr id="11" name="09-extension-pide-codigo.png" descr="09-extension-pide-codigo.png" title="09-extension-pide-codigo.png"/>
             <wp:cNvGraphicFramePr>
               <a:graphicFrameLocks xmlns:a="http://schemas.openxmlformats.org/drawingml/2006/main" noChangeAspect="1"/>
             </wp:cNvGraphicFramePr>
@@ -1352,6 +1288,70 @@
                   <pic:spPr bwMode="auto">
                     <a:xfrm>
                       <a:off x="0" y="0"/>
+                      <a:ext cx="3048000" cy="2219325"/>
+                    </a:xfrm>
+                    <a:prstGeom prst="rect">
+                      <a:avLst/>
+                    </a:prstGeom>
+                  </pic:spPr>
+                </pic:pic>
+              </a:graphicData>
+            </a:graphic>
+          </wp:inline>
+        </w:drawing>
+      </w:r>
+    </w:p>
+    <w:p>
+      <w:pPr>
+        <w:spacing w:after="120"/>
+      </w:pPr>
+      <w:r>
+        <w:t xml:space="preserve">Debe decir </w:t>
+      </w:r>
+      <w:r>
+        <w:rPr>
+          <w:b/>
+          <w:bCs/>
+        </w:rPr>
+        <w:t xml:space="preserve">Conectado al sistema</w:t>
+      </w:r>
+      <w:r>
+        <w:t xml:space="preserve"> y mostrar tu cuenta de MercadoEnvíos.</w:t>
+      </w:r>
+    </w:p>
+    <w:p>
+      <w:pPr>
+        <w:spacing w:after="200" w:before="80"/>
+        <w:jc w:val="center"/>
+      </w:pPr>
+      <w:r>
+        <w:drawing>
+          <wp:inline distT="0" distB="0" distL="0" distR="0">
+            <wp:extent cx="3048000" cy="2324100"/>
+            <wp:effectExtent t="0" r="0" b="0" l="0"/>
+            <wp:docPr id="12" name="10-extension-conectada.png" descr="10-extension-conectada.png" title="10-extension-conectada.png"/>
+            <wp:cNvGraphicFramePr>
+              <a:graphicFrameLocks xmlns:a="http://schemas.openxmlformats.org/drawingml/2006/main" noChangeAspect="1"/>
+            </wp:cNvGraphicFramePr>
+            <a:graphic xmlns:a="http://schemas.openxmlformats.org/drawingml/2006/main">
+              <a:graphicData uri="http://schemas.openxmlformats.org/drawingml/2006/picture">
+                <pic:pic xmlns:pic="http://schemas.openxmlformats.org/drawingml/2006/picture">
+                  <pic:nvPicPr>
+                    <pic:cNvPr id="0" name="" descr=""/>
+                    <pic:cNvPicPr>
+                      <a:picLocks noChangeAspect="1" noChangeArrowheads="1"/>
+                    </pic:cNvPicPr>
+                  </pic:nvPicPr>
+                  <pic:blipFill>
+                    <a:blip r:embed="rId19" cstate="none"/>
+                    <a:srcRect/>
+                    <a:stretch>
+                      <a:fillRect/>
+                    </a:stretch>
+                  </pic:blipFill>
+                  <pic:spPr bwMode="auto">
+                    <a:xfrm>
+                      <a:off x="0" y="0"/>
                       <a:ext cx="3048000" cy="2324100"/>
                     </a:xfrm>
                     <a:prstGeom prst="rect">
@@ -1368,7 +1368,7 @@
     <w:p>
       <w:pPr>
         <w:keepNext/>
-        <w:spacing w:before="300" w:after="100"/>
+        <w:spacing w:after="100" w:before="300"/>
       </w:pPr>
       <w:r>
         <w:rPr>
@@ -1411,7 +1411,7 @@
     <w:p>
       <w:pPr>
         <w:keepNext/>
-        <w:spacing w:before="300" w:after="100"/>
+        <w:spacing w:after="100" w:before="300"/>
       </w:pPr>
       <w:r>
         <w:rPr>
@@ -1455,7 +1455,7 @@
           <w:b/>
           <w:bCs/>
         </w:rPr>
-        <w:t xml:space="preserve">Listo</w:t>
+        <w:t xml:space="preserve">✅ Listo</w:t>
       </w:r>
       <w:r>
         <w:t xml:space="preserve"> con lo que trajo de cada cuenta.</w:t>
@@ -1463,26 +1463,6 @@
     </w:p>
     <w:p>
       <w:pPr>
-        <w:pBdr>
-          <w:top w:val="dashed" w:color="AAAAAA" w:sz="6"/>
-          <w:bottom w:val="dashed" w:color="AAAAAA" w:sz="6"/>
-          <w:left w:val="dashed" w:color="AAAAAA" w:sz="6"/>
-          <w:right w:val="dashed" w:color="AAAAAA" w:sz="6"/>
-        </w:pBdr>
-        <w:spacing w:before="80" w:after="200"/>
-        <w:jc w:val="center"/>
-      </w:pPr>
-      <w:r>
-        <w:rPr>
-          <w:i/>
-          <w:iCs/>
-          <w:color w:val="888888"/>
-        </w:rPr>
-        <w:t xml:space="preserve">[ Foto: aviso verde «Listo» con las cuentas ]</w:t>
-      </w:r>
-    </w:p>
-    <w:p>
-      <w:pPr>
         <w:spacing w:after="120"/>
       </w:pPr>
       <w:r>
@@ -1501,31 +1481,117 @@
     </w:p>
     <w:p>
       <w:pPr>
-        <w:pBdr>
-          <w:top w:val="dashed" w:color="AAAAAA" w:sz="6"/>
-          <w:bottom w:val="dashed" w:color="AAAAAA" w:sz="6"/>
-          <w:left w:val="dashed" w:color="AAAAAA" w:sz="6"/>
-          <w:right w:val="dashed" w:color="AAAAAA" w:sz="6"/>
-        </w:pBdr>
-        <w:spacing w:before="80" w:after="200"/>
-        <w:jc w:val="center"/>
-      </w:pPr>
-      <w:r>
-        <w:rPr>
-          <w:i/>
-          <w:iCs/>
-          <w:color w:val="888888"/>
-        </w:rPr>
-        <w:t xml:space="preserve">[ Foto: ícono ME verde junto al reloj ]</w:t>
-      </w:r>
-    </w:p>
-    <w:p>
-      <w:pPr>
         <w:pStyle w:val="Heading1"/>
-        <w:spacing w:before="360" w:after="160"/>
+        <w:spacing w:after="160" w:before="360"/>
       </w:pPr>
       <w:r>
         <w:t xml:space="preserve">Cómo se usa cada día</w:t>
+      </w:r>
+    </w:p>
+    <w:p>
+      <w:pPr>
+        <w:keepNext/>
+        <w:spacing w:after="100" w:before="300"/>
+      </w:pPr>
+      <w:r>
+        <w:rPr>
+          <w:b/>
+          <w:bCs/>
+          <w:color w:val="0E7A4F"/>
+          <w:sz w:val="30"/>
+          <w:szCs w:val="30"/>
+        </w:rPr>
+        <w:t xml:space="preserve">Paso A  </w:t>
+      </w:r>
+      <w:r>
+        <w:rPr>
+          <w:b/>
+          <w:bCs/>
+          <w:sz w:val="26"/>
+          <w:szCs w:val="26"/>
+        </w:rPr>
+        <w:t xml:space="preserve">Los pagos llegan solos</w:t>
+      </w:r>
+    </w:p>
+    <w:p>
+      <w:pPr>
+        <w:spacing w:after="120"/>
+      </w:pPr>
+      <w:r>
+        <w:t xml:space="preserve">El programa trae </w:t>
+      </w:r>
+      <w:r>
+        <w:rPr>
+          <w:b/>
+          <w:bCs/>
+        </w:rPr>
+        <w:t xml:space="preserve">de lunes a sábado a las 8:00, 12:00, 4:00 y 7:00 p. m.</w:t>
+      </w:r>
+      <w:r>
+        <w:t xml:space="preserve"> Para cambiar las horas: en Pagos ME, </w:t>
+      </w:r>
+      <w:r>
+        <w:rPr>
+          <w:b/>
+          <w:bCs/>
+        </w:rPr>
+        <w:t xml:space="preserve">Traer automático → Configurar</w:t>
+      </w:r>
+      <w:r>
+        <w:t xml:space="preserve">. ¿Necesitas algo ya? Toca </w:t>
+      </w:r>
+      <w:r>
+        <w:rPr>
+          <w:b/>
+          <w:bCs/>
+        </w:rPr>
+        <w:t xml:space="preserve">Traer pagos y guías</w:t>
+      </w:r>
+      <w:r>
+        <w:t xml:space="preserve"> y espera el aviso verde.</w:t>
+      </w:r>
+    </w:p>
+    <w:p>
+      <w:pPr>
+        <w:keepNext/>
+        <w:spacing w:after="100" w:before="300"/>
+      </w:pPr>
+      <w:r>
+        <w:rPr>
+          <w:b/>
+          <w:bCs/>
+          <w:color w:val="0E7A4F"/>
+          <w:sz w:val="30"/>
+          <w:szCs w:val="30"/>
+        </w:rPr>
+        <w:t xml:space="preserve">Paso B  </w:t>
+      </w:r>
+      <w:r>
+        <w:rPr>
+          <w:b/>
+          <w:bCs/>
+          <w:sz w:val="26"/>
+          <w:szCs w:val="26"/>
+        </w:rPr>
+        <w:t xml:space="preserve">Verifica cada pago</w:t>
+      </w:r>
+    </w:p>
+    <w:p>
+      <w:pPr>
+        <w:spacing w:after="120"/>
+      </w:pPr>
+      <w:r>
+        <w:t xml:space="preserve">En Pagos ME, pestaña </w:t>
+      </w:r>
+      <w:r>
+        <w:rPr>
+          <w:b/>
+          <w:bCs/>
+        </w:rPr>
+        <w:t xml:space="preserve">Ventas</w:t>
+      </w:r>
+      <w:r>
+        <w:t xml:space="preserve">, tus ventas salen en tres grupos:</w:t>
       </w:r>
     </w:p>
     <w:p>
@@ -1542,10 +1608,30 @@
           <w:b/>
           <w:bCs/>
         </w:rPr>
-        <w:t xml:space="preserve">Solo:</w:t>
-      </w:r>
-      <w:r>
-        <w:t xml:space="preserve"> trae en los horarios de «Traer automático» (los cambias en Configurar).</w:t>
+        <w:t xml:space="preserve">Por verificar:</w:t>
+      </w:r>
+      <w:r>
+        <w:t xml:space="preserve"> el cliente pagó. Mira el pago y el comprobante y toca </w:t>
+      </w:r>
+      <w:r>
+        <w:rPr>
+          <w:b/>
+          <w:bCs/>
+        </w:rPr>
+        <w:t xml:space="preserve">✓ Pago correcto</w:t>
+      </w:r>
+      <w:r>
+        <w:t xml:space="preserve"> o </w:t>
+      </w:r>
+      <w:r>
+        <w:rPr>
+          <w:b/>
+          <w:bCs/>
+        </w:rPr>
+        <w:t xml:space="preserve">✗ Inválido</w:t>
+      </w:r>
+      <w:r>
+        <w:t xml:space="preserve">.</w:t>
       </w:r>
     </w:p>
     <w:p>
@@ -1562,10 +1648,10 @@
           <w:b/>
           <w:bCs/>
         </w:rPr>
-        <w:t xml:space="preserve">A mano:</w:t>
-      </w:r>
-      <w:r>
-        <w:t xml:space="preserve"> cuando quieras, «Traer pagos y guías» y espera el aviso verde.</w:t>
+        <w:t xml:space="preserve">Listos para despachar:</w:t>
+      </w:r>
+      <w:r>
+        <w:t xml:space="preserve"> pago verificado. Su guía ya está en Despachos.</w:t>
       </w:r>
     </w:p>
     <w:p>
@@ -1582,16 +1668,163 @@
           <w:b/>
           <w:bCs/>
         </w:rPr>
-        <w:t xml:space="preserve">Verifica</w:t>
-      </w:r>
-      <w:r>
-        <w:t xml:space="preserve"> los pagos contra el banco en la pestaña «Sin verificar» y después ve a Despachos: las guías ya están ahí.</w:t>
-      </w:r>
-    </w:p>
+        <w:t xml:space="preserve">Sin pago todavía:</w:t>
+      </w:r>
+      <w:r>
+        <w:t xml:space="preserve"> el cliente no ha pagado (o el pago todavía no se trajo).</w:t>
+      </w:r>
+    </w:p>
+    <w:p>
+      <w:pPr>
+        <w:spacing w:after="120"/>
+      </w:pPr>
+      <w:r>
+        <w:rPr>
+          <w:b/>
+          <w:bCs/>
+        </w:rPr>
+        <w:t xml:space="preserve">Atajo: 🏦 Comprobar con el banco.</w:t>
+      </w:r>
+      <w:r>
+        <w:t xml:space="preserve"> Sube los estados de cuenta del día (Bancamiga, Banesco, Mercantil o Provincial) y el sistema te dice qué pagos llegaron de verdad. Los seguros se aprueban todos con un clic. Banco de Venezuela no se puede, porque no deja exportar el estado de cuenta.</w:t>
+      </w:r>
+    </w:p>
+    <w:p>
+      <w:pPr>
+        <w:keepNext/>
+        <w:spacing w:after="100" w:before="300"/>
+      </w:pPr>
+      <w:r>
+        <w:rPr>
+          <w:b/>
+          <w:bCs/>
+          <w:color w:val="0E7A4F"/>
+          <w:sz w:val="30"/>
+          <w:szCs w:val="30"/>
+        </w:rPr>
+        <w:t xml:space="preserve">Paso C  </w:t>
+      </w:r>
+      <w:r>
+        <w:rPr>
+          <w:b/>
+          <w:bCs/>
+          <w:sz w:val="26"/>
+          <w:szCs w:val="26"/>
+        </w:rPr>
+        <w:t xml:space="preserve">Imprime en Despachos</w:t>
+      </w:r>
+    </w:p>
+    <w:p>
+      <w:pPr>
+        <w:spacing w:after="120"/>
+      </w:pPr>
+      <w:r>
+        <w:t xml:space="preserve">Las guías ya están en el lote de Despachos: </w:t>
+      </w:r>
+      <w:r>
+        <w:rPr>
+          <w:b/>
+          <w:bCs/>
+        </w:rPr>
+        <w:t xml:space="preserve">no hace falta bajarlas del portal</w:t>
+      </w:r>
+      <w:r>
+        <w:t xml:space="preserve">. Imprime como siempre.</w:t>
+      </w:r>
+    </w:p>
+    <w:tbl>
+      <w:tblPr>
+        <w:tblW w:type="dxa" w:w="9026"/>
+        <w:tblBorders>
+          <w:top w:val="single" w:color="auto" w:sz="4"/>
+          <w:left w:val="single" w:color="auto" w:sz="4"/>
+          <w:bottom w:val="single" w:color="auto" w:sz="4"/>
+          <w:right w:val="single" w:color="auto" w:sz="4"/>
+          <w:insideH w:val="single" w:color="auto" w:sz="4"/>
+          <w:insideV w:val="single" w:color="auto" w:sz="4"/>
+        </w:tblBorders>
+      </w:tblPr>
+      <w:tblGrid>
+        <w:gridCol w:w="9026"/>
+      </w:tblGrid>
+      <w:tr>
+        <w:tc>
+          <w:tcPr>
+            <w:tcW w:type="dxa" w:w="9026"/>
+            <w:tcBorders>
+              <w:top w:val="single" w:color="A7D7BE" w:sz="6"/>
+              <w:left w:val="single" w:color="A7D7BE" w:sz="6"/>
+              <w:bottom w:val="single" w:color="A7D7BE" w:sz="6"/>
+              <w:right w:val="single" w:color="A7D7BE" w:sz="6"/>
+            </w:tcBorders>
+            <w:shd w:fill="E8F5EE" w:color="auto" w:val="clear"/>
+            <w:tcMar>
+              <w:top w:type="dxa" w:w="140"/>
+              <w:left w:type="dxa" w:w="200"/>
+              <w:bottom w:type="dxa" w:w="140"/>
+              <w:right w:type="dxa" w:w="200"/>
+            </w:tcMar>
+          </w:tcPr>
+          <w:p>
+            <w:pPr>
+              <w:spacing w:after="80"/>
+            </w:pPr>
+            <w:r>
+              <w:rPr>
+                <w:b/>
+                <w:bCs/>
+                <w:color w:val="0E7A4F"/>
+              </w:rPr>
+              <w:t xml:space="preserve">Importante</w:t>
+            </w:r>
+          </w:p>
+          <w:p>
+            <w:pPr>
+              <w:spacing w:after="60"/>
+            </w:pPr>
+            <w:r>
+              <w:rPr>
+                <w:b/>
+                <w:bCs/>
+              </w:rPr>
+              <w:t xml:space="preserve">Despachos no imprime una guía si su pago no está verificado.</w:t>
+            </w:r>
+            <w:r>
+              <w:t xml:space="preserve"> Es a propósito: así no sale un paquete sin cobrar. Si tienes que despachar uno igual (un cliente de confianza, por ejemplo), en la guía toca </w:t>
+            </w:r>
+            <w:r>
+              <w:rPr>
+                <w:b/>
+                <w:bCs/>
+              </w:rPr>
+              <w:t xml:space="preserve">Despachar igual</w:t>
+            </w:r>
+            <w:r>
+              <w:t xml:space="preserve">.</w:t>
+            </w:r>
+          </w:p>
+          <w:p>
+            <w:pPr>
+              <w:spacing w:after="60"/>
+            </w:pPr>
+            <w:r>
+              <w:rPr>
+                <w:b/>
+                <w:bCs/>
+              </w:rPr>
+              <w:t xml:space="preserve">Ya no bajes las guías del portal a mano.</w:t>
+            </w:r>
+            <w:r>
+              <w:t xml:space="preserve"> Si una guía ya está en Despachos, el programa no trae el pago de esa venta.</w:t>
+            </w:r>
+          </w:p>
+        </w:tc>
+      </w:tr>
+    </w:tbl>
     <w:p>
       <w:pPr>
         <w:pStyle w:val="Heading1"/>
-        <w:spacing w:before="360" w:after="160"/>
+        <w:spacing w:after="160" w:before="360"/>
       </w:pPr>
       <w:r>
         <w:t xml:space="preserve">Preguntas frecuentes</w:t>
@@ -1600,7 +1833,58 @@
     <w:p>
       <w:pPr>
         <w:pStyle w:val="Heading2"/>
-        <w:spacing w:before="280" w:after="100"/>
+        <w:spacing w:after="100" w:before="280"/>
+      </w:pPr>
+      <w:r>
+        <w:t xml:space="preserve">Pagos ME dice que una cuenta de MercadoEnvíos «no corresponde»</w:t>
+      </w:r>
+    </w:p>
+    <w:p>
+      <w:pPr>
+        <w:spacing w:after="120"/>
+      </w:pPr>
+      <w:r>
+        <w:t xml:space="preserve">Ese Chrome tiene abierta una cuenta de MercadoEnvíos que no es ninguna de tus cuentas de MercadoLibre conectadas al sistema. Por seguridad no se trae nada de ella: en ese perfil de Chrome entra al portal con la cuenta correcta.</w:t>
+      </w:r>
+    </w:p>
+    <w:p>
+      <w:pPr>
+        <w:pStyle w:val="Heading2"/>
+        <w:spacing w:after="100" w:before="280"/>
+      </w:pPr>
+      <w:r>
+        <w:t xml:space="preserve">Una venta pagada sale en «Sin pago todavía»</w:t>
+      </w:r>
+    </w:p>
+    <w:p>
+      <w:pPr>
+        <w:spacing w:after="120"/>
+      </w:pPr>
+      <w:r>
+        <w:t xml:space="preserve">El pago todavía no se trajo: toca «Traer pagos y guías». Si sigue igual, revisa en el portal de MercadoEnvíos que el pago tenga comprobante cargado.</w:t>
+      </w:r>
+    </w:p>
+    <w:p>
+      <w:pPr>
+        <w:pStyle w:val="Heading2"/>
+        <w:spacing w:after="100" w:before="280"/>
+      </w:pPr>
+      <w:r>
+        <w:t xml:space="preserve">Venta con retiro en tienda</w:t>
+      </w:r>
+    </w:p>
+    <w:p>
+      <w:pPr>
+        <w:spacing w:after="120"/>
+      </w:pPr>
+      <w:r>
+        <w:t xml:space="preserve">No tiene guía de envío, así que no va a Despachos. El pago se verifica igual.</w:t>
+      </w:r>
+    </w:p>
+    <w:p>
+      <w:pPr>
+        <w:pStyle w:val="Heading2"/>
+        <w:spacing w:after="100" w:before="280"/>
       </w:pPr>
       <w:r>
         <w:t xml:space="preserve">¿Puedo usar solo la extensión, sin el programa?</w:t>
@@ -1617,7 +1901,7 @@
     <w:p>
       <w:pPr>
         <w:pStyle w:val="Heading2"/>
-        <w:spacing w:before="280" w:after="100"/>
+        <w:spacing w:after="100" w:before="280"/>
       </w:pPr>
       <w:r>
         <w:t xml:space="preserve">¿Y si la PC estaba apagada?</w:t>
@@ -1634,7 +1918,7 @@
     <w:p>
       <w:pPr>
         <w:pStyle w:val="Heading2"/>
-        <w:spacing w:before="280" w:after="100"/>
+        <w:spacing w:after="100" w:before="280"/>
       </w:pPr>
       <w:r>
         <w:t xml:space="preserve">La primera vez una cuenta tardó en traer</w:t>
@@ -1651,7 +1935,7 @@
     <w:p>
       <w:pPr>
         <w:pStyle w:val="Heading2"/>
-        <w:spacing w:before="280" w:after="100"/>
+        <w:spacing w:after="100" w:before="280"/>
       </w:pPr>
       <w:r>
         <w:t xml:space="preserve">¿Qué significan los colores del ícono ME?</w:t>
@@ -1700,7 +1984,7 @@
     <w:p>
       <w:pPr>
         <w:pStyle w:val="Heading2"/>
-        <w:spacing w:before="280" w:after="100"/>
+        <w:spacing w:after="100" w:before="280"/>
       </w:pPr>
       <w:r>
         <w:t xml:space="preserve">¿Necesitas ayuda?</w:t>
@@ -1725,8 +2009,41 @@
 </w:document>
 </file>
 
-<file path=word/comments.xml><?xml version="1.0" encoding="utf-8"?>
-<w:comments xmlns:cx="http://schemas.microsoft.com/office/drawing/2014/chartex" xmlns:cx1="http://schemas.microsoft.com/office/drawing/2015/9/8/chartex" xmlns:cx2="http://schemas.microsoft.com/office/drawing/2015/10/21/chartex" xmlns:cx3="http://schemas.microsoft.com/office/drawing/2016/5/9/chartex" xmlns:cx4="http://schemas.microsoft.com/office/drawing/2016/5/10/chartex" xmlns:cx5="http://schemas.microsoft.com/office/drawing/2016/5/11/chartex" xmlns:cx6="http://schemas.microsoft.com/office/drawing/2016/5/12/chartex" xmlns:cx7="http://schemas.microsoft.com/office/drawing/2016/5/13/chartex" xmlns:cx8="http://schemas.microsoft.com/office/drawing/2016/5/14/chartex" xmlns:mc="http://schemas.openxmlformats.org/markup-compatibility/2006" xmlns:aink="http://schemas.microsoft.com/office/drawing/2016/ink" xmlns:am3d="http://schemas.microsoft.com/office/drawing/2017/model3d" xmlns:o="urn:schemas-microsoft-com:office:office" xmlns:r="http://schemas.openxmlformats.org/officeDocument/2006/relationships" xmlns:m="http://schemas.openxmlformats.org/officeDocument/2006/math" xmlns:v="urn:schemas-microsoft-com:vml" xmlns:wp14="http://schemas.microsoft.com/office/word/2010/wordprocessingDrawing" xmlns:wp="http://schemas.openxmlformats.org/drawingml/2006/wordprocessingDrawing" xmlns:w10="urn:schemas-microsoft-com:office:word" xmlns:w="http://schemas.openxmlformats.org/wordprocessingml/2006/main" xmlns:w14="http://schemas.microsoft.com/office/word/2010/wordml" xmlns:w15="http://schemas.microsoft.com/office/word/2012/wordml" xmlns:w16cex="http://schemas.microsoft.com/office/word/2018/wordml/cex" xmlns:w16cid="http://schemas.microsoft.com/office/word/2016/wordml/cid" xmlns:w16="http://schemas.microsoft.com/office/word/2018/wordml" xmlns:w16sdtdh="http://schemas.microsoft.com/office/word/2020/wordml/sdtdatahash" xmlns:w16se="http://schemas.microsoft.com/office/word/2015/wordml/symex" xmlns:wpg="http://schemas.microsoft.com/office/word/2010/wordprocessingGroup" xmlns:wpi="http://schemas.microsoft.com/office/word/2010/wordprocessingInk" xmlns:wne="http://schemas.microsoft.com/office/word/2006/wordml" xmlns:wps="http://schemas.microsoft.com/office/word/2010/wordprocessingShape"/>
+<file path=word/endnotes.xml><?xml version="1.0" encoding="utf-8"?>
+<w:endnotes xmlns:wpc="http://schemas.microsoft.com/office/word/2010/wordprocessingCanvas" xmlns:mc="http://schemas.openxmlformats.org/markup-compatibility/2006" xmlns:o="urn:schemas-microsoft-com:office:office" xmlns:r="http://schemas.openxmlformats.org/officeDocument/2006/relationships" xmlns:m="http://schemas.openxmlformats.org/officeDocument/2006/math" xmlns:v="urn:schemas-microsoft-com:vml" xmlns:wp14="http://schemas.microsoft.com/office/word/2010/wordprocessingDrawing" xmlns:wp="http://schemas.openxmlformats.org/drawingml/2006/wordprocessingDrawing" xmlns:w10="urn:schemas-microsoft-com:office:word" xmlns:w="http://schemas.openxmlformats.org/wordprocessingml/2006/main" xmlns:w14="http://schemas.microsoft.com/office/word/2010/wordml" xmlns:w15="http://schemas.microsoft.com/office/word/2012/wordml" xmlns:wpg="http://schemas.microsoft.com/office/word/2010/wordprocessingGroup" xmlns:wpi="http://schemas.microsoft.com/office/word/2010/wordprocessingInk" xmlns:wne="http://schemas.microsoft.com/office/word/2006/wordml" xmlns:wps="http://schemas.microsoft.com/office/word/2010/wordprocessingShape" mc:Ignorable="w14 w15 wp14">
+  <w:endnote w:type="separator" w:id="-1">
+    <w:p>
+      <w:pPr>
+        <w:spacing w:after="0" w:line="240" w:lineRule="auto"/>
+      </w:pPr>
+      <w:r>
+        <w:rPr>
+          <w:rStyle w:val="EndnoteReference"/>
+        </w:rPr>
+        <w:endnoteRef/>
+      </w:r>
+      <w:r>
+        <w:separator/>
+      </w:r>
+    </w:p>
+  </w:endnote>
+  <w:endnote w:type="continuationSeparator" w:id="0">
+    <w:p>
+      <w:pPr>
+        <w:spacing w:after="0" w:line="240" w:lineRule="auto"/>
+      </w:pPr>
+      <w:r>
+        <w:rPr>
+          <w:rStyle w:val="EndnoteReference"/>
+        </w:rPr>
+        <w:endnoteRef/>
+      </w:r>
+      <w:r>
+        <w:continuationSeparator/>
+      </w:r>
+    </w:p>
+  </w:endnote>
+</w:endnotes>
 </file>
 
 <file path=word/footer1.xml><?xml version="1.0" encoding="utf-8"?>
@@ -1750,8 +2067,29 @@
         <w:szCs w:val="16"/>
       </w:rPr>
       <w:fldChar w:fldCharType="begin"/>
+    </w:r>
+    <w:r>
+      <w:rPr>
+        <w:color w:val="999999"/>
+        <w:sz w:val="16"/>
+        <w:szCs w:val="16"/>
+      </w:rPr>
       <w:instrText xml:space="preserve">PAGE</w:instrText>
+    </w:r>
+    <w:r>
+      <w:rPr>
+        <w:color w:val="999999"/>
+        <w:sz w:val="16"/>
+        <w:szCs w:val="16"/>
+      </w:rPr>
       <w:fldChar w:fldCharType="separate"/>
+    </w:r>
+    <w:r>
+      <w:rPr>
+        <w:color w:val="999999"/>
+        <w:sz w:val="16"/>
+        <w:szCs w:val="16"/>
+      </w:rPr>
       <w:fldChar w:fldCharType="end"/>
     </w:r>
   </w:p>
@@ -1799,7 +2137,7 @@
 <w:numbering xmlns:wpc="http://schemas.microsoft.com/office/word/2010/wordprocessingCanvas" xmlns:mc="http://schemas.openxmlformats.org/markup-compatibility/2006" xmlns:o="urn:schemas-microsoft-com:office:office" xmlns:r="http://schemas.openxmlformats.org/officeDocument/2006/relationships" xmlns:m="http://schemas.openxmlformats.org/officeDocument/2006/math" xmlns:v="urn:schemas-microsoft-com:vml" xmlns:wp14="http://schemas.microsoft.com/office/word/2010/wordprocessingDrawing" xmlns:wp="http://schemas.openxmlformats.org/drawingml/2006/wordprocessingDrawing" xmlns:w10="urn:schemas-microsoft-com:office:word" xmlns:w="http://schemas.openxmlformats.org/wordprocessingml/2006/main" xmlns:w14="http://schemas.microsoft.com/office/word/2010/wordml" xmlns:w15="http://schemas.microsoft.com/office/word/2012/wordml" xmlns:wpg="http://schemas.microsoft.com/office/word/2010/wordprocessingGroup" xmlns:wpi="http://schemas.microsoft.com/office/word/2010/wordprocessingInk" xmlns:wne="http://schemas.microsoft.com/office/word/2006/wordml" xmlns:wps="http://schemas.microsoft.com/office/word/2010/wordprocessingShape" mc:Ignorable="w14 w15 wp14">
   <w:abstractNum w:abstractNumId="1" w15:restartNumberingAfterBreak="0">
     <w:multiLevelType w:val="hybridMultilevel"/>
-    <w:lvl w:ilvl="0" w15:tentative="1">
+    <w:lvl w:ilvl="0" w:tentative="1">
       <w:start w:val="1"/>
       <w:numFmt w:val="bullet"/>
       <w:lvlText w:val="●"/>
@@ -1808,7 +2146,7 @@
         <w:ind w:left="720" w:hanging="360"/>
       </w:pPr>
     </w:lvl>
-    <w:lvl w:ilvl="1" w15:tentative="1">
+    <w:lvl w:ilvl="1" w:tentative="1">
       <w:start w:val="1"/>
       <w:numFmt w:val="bullet"/>
       <w:lvlText w:val="○"/>
@@ -1817,7 +2155,7 @@
         <w:ind w:left="1440" w:hanging="360"/>
       </w:pPr>
     </w:lvl>
-    <w:lvl w:ilvl="2" w15:tentative="1">
+    <w:lvl w:ilvl="2" w:tentative="1">
       <w:start w:val="1"/>
       <w:numFmt w:val="bullet"/>
       <w:lvlText w:val="■"/>
@@ -1826,7 +2164,7 @@
         <w:ind w:left="2160" w:hanging="360"/>
       </w:pPr>
     </w:lvl>
-    <w:lvl w:ilvl="3" w15:tentative="1">
+    <w:lvl w:ilvl="3" w:tentative="1">
       <w:start w:val="1"/>
       <w:numFmt w:val="bullet"/>
       <w:lvlText w:val="●"/>
@@ -1835,7 +2173,7 @@
         <w:ind w:left="2880" w:hanging="360"/>
       </w:pPr>
     </w:lvl>
-    <w:lvl w:ilvl="4" w15:tentative="1">
+    <w:lvl w:ilvl="4" w:tentative="1">
       <w:start w:val="1"/>
       <w:numFmt w:val="bullet"/>
       <w:lvlText w:val="○"/>
@@ -1844,7 +2182,7 @@
         <w:ind w:left="3600" w:hanging="360"/>
       </w:pPr>
     </w:lvl>
-    <w:lvl w:ilvl="5" w15:tentative="1">
+    <w:lvl w:ilvl="5" w:tentative="1">
       <w:start w:val="1"/>
       <w:numFmt w:val="bullet"/>
       <w:lvlText w:val="■"/>
@@ -1853,7 +2191,7 @@
         <w:ind w:left="4320" w:hanging="360"/>
       </w:pPr>
     </w:lvl>
-    <w:lvl w:ilvl="6" w15:tentative="1">
+    <w:lvl w:ilvl="6" w:tentative="1">
       <w:start w:val="1"/>
       <w:numFmt w:val="bullet"/>
       <w:lvlText w:val="●"/>
@@ -1862,7 +2200,7 @@
         <w:ind w:left="5040" w:hanging="360"/>
       </w:pPr>
     </w:lvl>
-    <w:lvl w:ilvl="7" w15:tentative="1">
+    <w:lvl w:ilvl="7" w:tentative="1">
       <w:start w:val="1"/>
       <w:numFmt w:val="bullet"/>
       <w:lvlText w:val="●"/>
@@ -1871,7 +2209,7 @@
         <w:ind w:left="5760" w:hanging="360"/>
       </w:pPr>
     </w:lvl>
-    <w:lvl w:ilvl="8" w15:tentative="1">
+    <w:lvl w:ilvl="8" w:tentative="1">
       <w:start w:val="1"/>
       <w:numFmt w:val="bullet"/>
       <w:lvlText w:val="●"/>
@@ -1883,7 +2221,7 @@
   </w:abstractNum>
   <w:abstractNum w:abstractNumId="2" w15:restartNumberingAfterBreak="0">
     <w:multiLevelType w:val="hybridMultilevel"/>
-    <w:lvl w:ilvl="0" w15:tentative="1">
+    <w:lvl w:ilvl="0" w:tentative="1">
       <w:start w:val="1"/>
       <w:numFmt w:val="bullet"/>
       <w:lvlText w:val="•"/>
@@ -1920,37 +2258,24 @@
     </w:rPrDefault>
     <w:pPrDefault/>
   </w:docDefaults>
-  <w:style w:type="paragraph" w:styleId="Title">
-    <w:name w:val="Title"/>
-    <w:basedOn w:val="Normal"/>
-    <w:next w:val="Normal"/>
+  <w:style w:type="paragraph" w:styleId="Normal" w:default="1">
+    <w:name w:val="Normal"/>
     <w:qFormat/>
-    <w:rPr>
-      <w:sz w:val="56"/>
-      <w:szCs w:val="56"/>
-    </w:rPr>
   </w:style>
-  <w:style w:type="paragraph" w:styleId="Heading1">
-    <w:name w:val="Heading 1"/>
-    <w:basedOn w:val="Normal"/>
-    <w:next w:val="Normal"/>
-    <w:qFormat/>
-    <w:rPr>
-      <w:color w:val="2E74B5"/>
-      <w:sz w:val="32"/>
-      <w:szCs w:val="32"/>
-    </w:rPr>
-  </w:style>
-  <w:style w:type="paragraph" w:styleId="Heading2">
-    <w:name w:val="Heading 2"/>
-    <w:basedOn w:val="Normal"/>
-    <w:next w:val="Normal"/>
-    <w:qFormat/>
-    <w:rPr>
-      <w:color w:val="2E74B5"/>
-      <w:sz w:val="26"/>
-      <w:szCs w:val="26"/>
-    </w:rPr>
+  <w:style w:type="table" w:styleId="TableNormal" w:default="true">
+    <w:name w:val="Normal Table"/>
+    <w:uiPriority w:val="99"/>
+    <w:semiHidden/>
+    <w:unhideWhenUsed/>
+    <w:tblPr>
+      <w:tblInd w:type="dxa" w:w="0"/>
+      <w:tblCellMar>
+        <w:top w:type="dxa" w:w="0"/>
+        <w:left w:type="dxa" w:w="108"/>
+        <w:bottom w:type="dxa" w:w="0"/>
+        <w:right w:type="dxa" w:w="108"/>
+      </w:tblCellMar>
+    </w:tblPr>
   </w:style>
   <w:style w:type="paragraph" w:styleId="Heading3">
     <w:name w:val="Heading 3"/>
@@ -2054,6 +2379,43 @@
       <w:szCs w:val="20"/>
     </w:rPr>
   </w:style>
+  <w:style w:type="character" w:styleId="EndnoteReference">
+    <w:name w:val="endnote reference"/>
+    <w:basedOn w:val="DefaultParagraphFont"/>
+    <w:uiPriority w:val="99"/>
+    <w:semiHidden/>
+    <w:unhideWhenUsed/>
+    <w:rPr>
+      <w:vertAlign w:val="superscript"/>
+    </w:rPr>
+  </w:style>
+  <w:style w:type="paragraph" w:styleId="EndnoteText">
+    <w:name w:val="endnote text"/>
+    <w:basedOn w:val="Normal"/>
+    <w:link w:val="EndnoteTextChar"/>
+    <w:uiPriority w:val="99"/>
+    <w:semiHidden/>
+    <w:unhideWhenUsed/>
+    <w:pPr>
+      <w:spacing w:after="0" w:line="240" w:lineRule="auto"/>
+    </w:pPr>
+    <w:rPr>
+      <w:sz w:val="20"/>
+      <w:szCs w:val="20"/>
+    </w:rPr>
+  </w:style>
+  <w:style w:type="character" w:styleId="EndnoteTextChar">
+    <w:name w:val="Endnote Text Char"/>
+    <w:basedOn w:val="DefaultParagraphFont"/>
+    <w:link w:val="EndnoteText"/>
+    <w:uiPriority w:val="99"/>
+    <w:semiHidden/>
+    <w:unhideWhenUsed/>
+    <w:rPr>
+      <w:sz w:val="20"/>
+      <w:szCs w:val="20"/>
+    </w:rPr>
+  </w:style>
   <w:style w:type="paragraph" w:styleId="Title">
     <w:name w:val="Title"/>
     <w:basedOn w:val="Normal"/>
@@ -2102,4 +2464,294 @@
     </w:rPr>
   </w:style>
 </w:styles>
+</file>
+
+<file path=word/theme/theme1.xml><?xml version="1.0" encoding="utf-8"?>
+<a:theme xmlns:a="http://schemas.openxmlformats.org/drawingml/2006/main" name="Office Theme">
+  <a:themeElements>
+    <a:clrScheme name="Office">
+      <a:dk1>
+        <a:sysClr val="windowText" lastClr="000000"/>
+      </a:dk1>
+      <a:lt1>
+        <a:sysClr val="window" lastClr="FFFFFF"/>
+      </a:lt1>
+      <a:dk2>
+        <a:srgbClr val="44546A"/>
+      </a:dk2>
+      <a:lt2>
+        <a:srgbClr val="E7E6E6"/>
+      </a:lt2>
+      <a:accent1>
+        <a:srgbClr val="4472C4"/>
+      </a:accent1>
+      <a:accent2>
+        <a:srgbClr val="ED7D31"/>
+      </a:accent2>
+      <a:accent3>
+        <a:srgbClr val="A5A5A5"/>
+      </a:accent3>
+      <a:accent4>
+        <a:srgbClr val="FFC000"/>
+      </a:accent4>
+      <a:accent5>
+        <a:srgbClr val="5B9BD5"/>
+      </a:accent5>
+      <a:accent6>
+        <a:srgbClr val="70AD47"/>
+      </a:accent6>
+      <a:hlink>
+        <a:srgbClr val="0563C1"/>
+      </a:hlink>
+      <a:folHlink>
+        <a:srgbClr val="954F72"/>
+      </a:folHlink>
+    </a:clrScheme>
+    <a:fontScheme name="Office">
+      <a:majorFont>
+        <a:latin typeface="Calibri Light" panose="020F0302020204030204"/>
+        <a:ea typeface=""/>
+        <a:cs typeface=""/>
+        <a:font script="Jpan" typeface="游ゴシック Light"/>
+        <a:font script="Hang" typeface="맑은 고딕"/>
+        <a:font script="Hans" typeface="等线 Light"/>
+        <a:font script="Hant" typeface="新細明體"/>
+        <a:font script="Arab" typeface="Times New Roman"/>
+        <a:font script="Hebr" typeface="Times New Roman"/>
+        <a:font script="Thai" typeface="Angsana New"/>
+        <a:font script="Ethi" typeface="Nyala"/>
+        <a:font script="Beng" typeface="Vrinda"/>
+        <a:font script="Gujr" typeface="Shruti"/>
+        <a:font script="Khmr" typeface="MoolBoran"/>
+        <a:font script="Knda" typeface="Tunga"/>
+        <a:font script="Guru" typeface="Raavi"/>
+        <a:font script="Cans" typeface="Euphemia"/>
+        <a:font script="Cher" typeface="Plantagenet Cherokee"/>
+        <a:font script="Yiii" typeface="Microsoft Yi Baiti"/>
+        <a:font script="Tibt" typeface="Microsoft Himalaya"/>
+        <a:font script="Thaa" typeface="MV Boli"/>
+        <a:font script="Deva" typeface="Mangal"/>
+        <a:font script="Telu" typeface="Gautami"/>
+        <a:font script="Taml" typeface="Latha"/>
+        <a:font script="Syrc" typeface="Estrangelo Edessa"/>
+        <a:font script="Orya" typeface="Kalinga"/>
+        <a:font script="Mlym" typeface="Kartika"/>
+        <a:font script="Laoo" typeface="DokChampa"/>
+        <a:font script="Sinh" typeface="Iskoola Pota"/>
+        <a:font script="Mong" typeface="Mongolian Baiti"/>
+        <a:font script="Viet" typeface="Times New Roman"/>
+        <a:font script="Uigh" typeface="Microsoft Uighur"/>
+        <a:font script="Geor" typeface="Sylfaen"/>
+        <a:font script="Armn" typeface="Arial"/>
+        <a:font script="Bugi" typeface="Leelawadee UI"/>
+        <a:font script="Bopo" typeface="Microsoft JhengHei"/>
+        <a:font script="Java" typeface="Javanese Text"/>
+        <a:font script="Lisu" typeface="Segoe UI"/>
+        <a:font script="Mymr" typeface="Myanmar Text"/>
+        <a:font script="Nkoo" typeface="Ebrima"/>
+        <a:font script="Olck" typeface="Nirmala UI"/>
+        <a:font script="Osma" typeface="Ebrima"/>
+        <a:font script="Phag" typeface="Phagspa"/>
+        <a:font script="Syrn" typeface="Estrangelo Edessa"/>
+        <a:font script="Syrj" typeface="Estrangelo Edessa"/>
+        <a:font script="Syre" typeface="Estrangelo Edessa"/>
+        <a:font script="Sora" typeface="Nirmala UI"/>
+        <a:font script="Tale" typeface="Microsoft Tai Le"/>
+        <a:font script="Talu" typeface="Microsoft New Tai Lue"/>
+        <a:font script="Tfng" typeface="Ebrima"/>
+      </a:majorFont>
+      <a:minorFont>
+        <a:latin typeface="Calibri" panose="020F0502020204030204"/>
+        <a:ea typeface=""/>
+        <a:cs typeface=""/>
+        <a:font script="Jpan" typeface="游明朝"/>
+        <a:font script="Hang" typeface="맑은 고딕"/>
+        <a:font script="Hans" typeface="等线"/>
+        <a:font script="Hant" typeface="新細明體"/>
+        <a:font script="Arab" typeface="Arial"/>
+        <a:font script="Hebr" typeface="Arial"/>
+        <a:font script="Thai" typeface="Cordia New"/>
+        <a:font script="Ethi" typeface="Nyala"/>
+        <a:font script="Beng" typeface="Vrinda"/>
+        <a:font script="Gujr" typeface="Shruti"/>
+        <a:font script="Khmr" typeface="DaunPenh"/>
+        <a:font script="Knda" typeface="Tunga"/>
+        <a:font script="Guru" typeface="Raavi"/>
+        <a:font script="Cans" typeface="Euphemia"/>
+        <a:font script="Cher" typeface="Plantagenet Cherokee"/>
+        <a:font script="Yiii" typeface="Microsoft Yi Baiti"/>
+        <a:font script="Tibt" typeface="Microsoft Himalaya"/>
+        <a:font script="Thaa" typeface="MV Boli"/>
+        <a:font script="Deva" typeface="Mangal"/>
+        <a:font script="Telu" typeface="Gautami"/>
+        <a:font script="Taml" typeface="Latha"/>
+        <a:font script="Syrc" typeface="Estrangelo Edessa"/>
+        <a:font script="Orya" typeface="Kalinga"/>
+        <a:font script="Mlym" typeface="Kartika"/>
+        <a:font script="Laoo" typeface="DokChampa"/>
+        <a:font script="Sinh" typeface="Iskoola Pota"/>
+        <a:font script="Mong" typeface="Mongolian Baiti"/>
+        <a:font script="Viet" typeface="Arial"/>
+        <a:font script="Uigh" typeface="Microsoft Uighur"/>
+        <a:font script="Geor" typeface="Sylfaen"/>
+        <a:font script="Armn" typeface="Arial"/>
+        <a:font script="Bugi" typeface="Leelawadee UI"/>
+        <a:font script="Bopo" typeface="Microsoft JhengHei"/>
+        <a:font script="Java" typeface="Javanese Text"/>
+        <a:font script="Lisu" typeface="Segoe UI"/>
+        <a:font script="Mymr" typeface="Myanmar Text"/>
+        <a:font script="Nkoo" typeface="Ebrima"/>
+        <a:font script="Olck" typeface="Nirmala UI"/>
+        <a:font script="Osma" typeface="Ebrima"/>
+        <a:font script="Phag" typeface="Phagspa"/>
+        <a:font script="Syrn" typeface="Estrangelo Edessa"/>
+        <a:font script="Syrj" typeface="Estrangelo Edessa"/>
+        <a:font script="Syre" typeface="Estrangelo Edessa"/>
+        <a:font script="Sora" typeface="Nirmala UI"/>
+        <a:font script="Tale" typeface="Microsoft Tai Le"/>
+        <a:font script="Talu" typeface="Microsoft New Tai Lue"/>
+        <a:font script="Tfng" typeface="Ebrima"/>
+      </a:minorFont>
+    </a:fontScheme>
+    <a:fmtScheme name="Office">
+      <a:fillStyleLst>
+        <a:solidFill>
+          <a:schemeClr val="phClr"/>
+        </a:solidFill>
+        <a:gradFill rotWithShape="true">
+          <a:gsLst>
+            <a:gs pos="0">
+              <a:schemeClr val="phClr">
+                <a:lumMod val="110000"/>
+                <a:satMod val="105000"/>
+                <a:tint val="67000"/>
+              </a:schemeClr>
+            </a:gs>
+            <a:gs pos="50000">
+              <a:schemeClr val="phClr">
+                <a:lumMod val="105000"/>
+                <a:satMod val="103000"/>
+                <a:tint val="73000"/>
+              </a:schemeClr>
+            </a:gs>
+            <a:gs pos="100000">
+              <a:schemeClr val="phClr">
+                <a:lumMod val="105000"/>
+                <a:satMod val="109000"/>
+                <a:tint val="81000"/>
+              </a:schemeClr>
+            </a:gs>
+          </a:gsLst>
+          <a:lin ang="5400000" scaled="false"/>
+        </a:gradFill>
+        <a:gradFill rotWithShape="true">
+          <a:gsLst>
+            <a:gs pos="0">
+              <a:schemeClr val="phClr">
+                <a:satMod val="103000"/>
+                <a:lumMod val="102000"/>
+                <a:tint val="94000"/>
+              </a:schemeClr>
+            </a:gs>
+            <a:gs pos="50000">
+              <a:schemeClr val="phClr">
+                <a:satMod val="110000"/>
+                <a:lumMod val="100000"/>
+                <a:shade val="100000"/>
+              </a:schemeClr>
+            </a:gs>
+            <a:gs pos="100000">
+              <a:schemeClr val="phClr">
+                <a:lumMod val="99000"/>
+                <a:satMod val="120000"/>
+                <a:shade val="78000"/>
+              </a:schemeClr>
+            </a:gs>
+          </a:gsLst>
+          <a:lin ang="5400000" scaled="false"/>
+        </a:gradFill>
+      </a:fillStyleLst>
+      <a:lnStyleLst>
+        <a:ln w="6350" cap="flat" cmpd="sng" algn="ctr">
+          <a:solidFill>
+            <a:schemeClr val="phClr"/>
+          </a:solidFill>
+          <a:prstDash val="solid"/>
+          <a:miter lim="800000"/>
+        </a:ln>
+        <a:ln w="12700" cap="flat" cmpd="sng" algn="ctr">
+          <a:solidFill>
+            <a:schemeClr val="phClr"/>
+          </a:solidFill>
+          <a:prstDash val="solid"/>
+          <a:miter lim="800000"/>
+        </a:ln>
+        <a:ln w="19050" cap="flat" cmpd="sng" algn="ctr">
+          <a:solidFill>
+            <a:schemeClr val="phClr"/>
+          </a:solidFill>
+          <a:prstDash val="solid"/>
+          <a:miter lim="800000"/>
+        </a:ln>
+      </a:lnStyleLst>
+      <a:effectStyleLst>
+        <a:effectStyle>
+          <a:effectLst/>
+        </a:effectStyle>
+        <a:effectStyle>
+          <a:effectLst/>
+        </a:effectStyle>
+        <a:effectStyle>
+          <a:effectLst>
+            <a:outerShdw blurRad="57150" dist="19050" dir="5400000" algn="ctr" rotWithShape="false">
+              <a:srgbClr val="000000">
+                <a:alpha val="63000"/>
+              </a:srgbClr>
+            </a:outerShdw>
+          </a:effectLst>
+        </a:effectStyle>
+      </a:effectStyleLst>
+      <a:bgFillStyleLst>
+        <a:solidFill>
+          <a:schemeClr val="phClr"/>
+        </a:solidFill>
+        <a:solidFill>
+          <a:schemeClr val="phClr">
+            <a:tint val="95000"/>
+            <a:satMod val="170000"/>
+          </a:schemeClr>
+        </a:solidFill>
+        <a:gradFill rotWithShape="true">
+          <a:gsLst>
+            <a:gs pos="0">
+              <a:schemeClr val="phClr">
+                <a:tint val="93000"/>
+                <a:satMod val="150000"/>
+                <a:shade val="98000"/>
+                <a:lumMod val="102000"/>
+              </a:schemeClr>
+            </a:gs>
+            <a:gs pos="50000">
+              <a:schemeClr val="phClr">
+                <a:tint val="98000"/>
+                <a:satMod val="130000"/>
+                <a:shade val="90000"/>
+                <a:lumMod val="103000"/>
+              </a:schemeClr>
+            </a:gs>
+            <a:gs pos="100000">
+              <a:schemeClr val="phClr">
+                <a:shade val="63000"/>
+                <a:satMod val="120000"/>
+              </a:schemeClr>
+            </a:gs>
+          </a:gsLst>
+          <a:lin ang="5400000" scaled="false"/>
+        </a:gradFill>
+      </a:bgFillStyleLst>
+    </a:fmtScheme>
+  </a:themeElements>
+  <a:objectDefaults/>
+  <a:extraClrSchemeLst/>
+</a:theme>
 </file>
</xml_diff>

<commit_message>
Pagos ME: 'Antes de empezar' (PC con Windows, Google Chrome y la sesion de MercadoEnvios iniciada en el perfil de cada cuenta) y paso 3: la tienda se abre sola al finalizar, asegurarse de que sea el perfil con la sesion; si no, el enlace. Guia PDF igual
Co-Authored-By: Claude Opus 5.5 <noreply@anthropic.com>
</commit_message>
<xml_diff>
--- a/tools/vigilante-pagos-me/guia/Guia-Pagos-MercadoEnvios.docx
+++ b/tools/vigilante-pagos-me/guia/Guia-Pagos-MercadoEnvios.docx
@@ -264,7 +264,17 @@
         <w:t xml:space="preserve">un perfil por cada cuenta de MercadoLibre</w:t>
       </w:r>
       <w:r>
-        <w:t xml:space="preserve">, y la sesión de MercadoLibre abierta en cada perfil.</w:t>
+        <w:t xml:space="preserve">, y en cada perfil </w:t>
+      </w:r>
+      <w:r>
+        <w:rPr>
+          <w:b/>
+          <w:bCs/>
+        </w:rPr>
+        <w:t xml:space="preserve">la sesión de MercadoEnvíos iniciada</w:t>
+      </w:r>
+      <w:r>
+        <w:t xml:space="preserve"> (entra una vez al portal de MercadoEnvíos con tu cuenta y déjala abierta).</w:t>
       </w:r>
     </w:p>
     <w:p>
@@ -990,27 +1000,17 @@
         <w:spacing w:after="120"/>
       </w:pPr>
       <w:r>
-        <w:t xml:space="preserve">Se abre la tienda de Chrome. </w:t>
-      </w:r>
-      <w:r>
-        <w:rPr>
-          <w:b/>
-          <w:bCs/>
-        </w:rPr>
-        <w:t xml:space="preserve">Antes de seguir, fíjate en qué perfil de Chrome se abrió</w:t>
-      </w:r>
-      <w:r>
-        <w:t xml:space="preserve"> (la foto de arriba a la derecha): tiene que ser el perfil donde entras a </w:t>
-      </w:r>
-      <w:r>
-        <w:rPr>
-          <w:b/>
-          <w:bCs/>
-        </w:rPr>
-        <w:t xml:space="preserve">tu cuenta de MercadoLibre</w:t>
-      </w:r>
-      <w:r>
-        <w:t xml:space="preserve">. Si no lo es, cámbiate a ese perfil y abre ahí </w:t>
+        <w:t xml:space="preserve">Al finalizar la instalación se abre solo Chrome en la tienda. </w:t>
+      </w:r>
+      <w:r>
+        <w:rPr>
+          <w:b/>
+          <w:bCs/>
+        </w:rPr>
+        <w:t xml:space="preserve">Antes de seguir, asegúrate de que esa ventana sea la del perfil donde tienes iniciada la sesión de MercadoEnvíos</w:t>
+      </w:r>
+      <w:r>
+        <w:t xml:space="preserve"> (mira la foto de arriba a la derecha). Si se abrió en otro perfil, no se abrió o quieres agregarla a mano: cámbiate a ese perfil y entra a </w:t>
       </w:r>
       <w:r>
         <w:rPr>

</xml_diff>